<commit_message>
feat(lung): freeze controlled feedback candidate
</commit_message>
<xml_diff>
--- a/panels/lung_329_pdl1/templates/lung_329_pdl1_golden_template_v2.docx
+++ b/panels/lung_329_pdl1/templates/lung_329_pdl1_golden_template_v2.docx
@@ -6617,22 +6617,7 @@
           <w:sz w:val="24"/>
           <w:szCs w:val="24"/>
         </w:rPr>
-        <w:t>分析样本基因变异并报告分子事件；患者级用药提示仅在肺癌专属规则完成审核后输出。</w:t>
-      </w:r>
-      <w:r>
-        <w:rPr>
-          <w:rFonts w:hint="eastAsia" w:ascii="微软雅黑" w:hAnsi="微软雅黑" w:cs="LPJNJT+Arial Unicode MS"/>
-          <w:sz w:val="24"/>
-          <w:szCs w:val="24"/>
-          <w:lang w:val="en-US" w:eastAsia="zh-CN"/>
-        </w:rPr>
-      </w:r>
-      <w:r>
-        <w:rPr>
-          <w:rFonts w:hint="eastAsia" w:ascii="微软雅黑" w:hAnsi="微软雅黑" w:cs="LPJNJT+Arial Unicode MS"/>
-          <w:sz w:val="24"/>
-          <w:szCs w:val="24"/>
-        </w:rPr>
+        <w:t>分析样本基因变异并报告分子事件；患者级用药提示仅由经审核的肺癌精确事件规则在治疗上下文符合时输出，并须病例级复核。</w:t>
       </w:r>
     </w:p>
     <w:p>
@@ -8957,7 +8942,7 @@
                 <w:highlight w:val="none"/>
                 <w:lang w:val="en-US" w:eastAsia="zh-CN"/>
               </w:rPr>
-              <w:t>-</w:t>
+              <w:t>见精确事件</w:t>
             </w:r>
           </w:p>
         </w:tc>
@@ -9009,7 +8994,7 @@
                 <w:highlight w:val="none"/>
                 <w:lang w:val="en-US" w:eastAsia="zh-CN"/>
               </w:rPr>
-              <w:t>待审核，当前关闭</w:t>
+              <w:t>见靶向用药表</w:t>
             </w:r>
           </w:p>
         </w:tc>
@@ -9061,7 +9046,7 @@
                 <w:highlight w:val="none"/>
                 <w:lang w:val="en-US" w:eastAsia="zh-CN"/>
               </w:rPr>
-              <w:t>肺癌专属治疗知识和事件级药物规则尚未完成报告组二审及病例级验收，当前版本不输出患者级用药结论。</w:t>
+              <w:t>本项目仅输出经审核的肺癌精确事件规则；须同时满足基因、转录本、位点及治疗上下文，且交付前须完成病例级复核。泛基因、跨癌种及未审核规则不展示。</w:t>
             </w:r>
           </w:p>
         </w:tc>
@@ -9114,31 +9099,7 @@
                 <w:highlight w:val="none"/>
                 <w:lang w:val="en-US" w:eastAsia="zh-CN"/>
               </w:rPr>
-              <w:t>-</w:t>
-            </w:r>
-            <w:r>
-              <w:rPr>
-                <w:rFonts w:hint="eastAsia" w:ascii="微软雅黑" w:hAnsi="微软雅黑" w:cs="微软雅黑"/>
-                <w:bCs/>
-                <w:color w:val="000000"/>
-                <w:kern w:val="2"/>
-                <w:sz w:val="20"/>
-                <w:szCs w:val="20"/>
-                <w:highlight w:val="none"/>
-                <w:lang w:val="en-US" w:eastAsia="zh-CN"/>
-              </w:rPr>
-            </w:r>
-            <w:r>
-              <w:rPr>
-                <w:rFonts w:hint="default" w:ascii="微软雅黑" w:hAnsi="微软雅黑" w:eastAsia="微软雅黑" w:cs="微软雅黑"/>
-                <w:bCs/>
-                <w:color w:val="000000"/>
-                <w:kern w:val="2"/>
-                <w:sz w:val="20"/>
-                <w:szCs w:val="20"/>
-                <w:highlight w:val="none"/>
-                <w:lang w:val="en-US" w:eastAsia="zh-CN"/>
-              </w:rPr>
+              <w:t>需病例级复核</w:t>
             </w:r>
           </w:p>
         </w:tc>
@@ -11302,7 +11263,7 @@
     </w:p>
     <w:p>
       <w:r>
-        <w:t>肺癌专属治疗知识和事件级药物规则尚未完成报告组二审及病例级验收，当前版本不输出患者级用药结论。</w:t>
+        <w:t>本项目仅输出经审核的肺癌精确事件规则；须同时满足基因、转录本、位点及治疗上下文，且交付前须完成病例级复核。泛基因、跨癌种及未审核规则不展示。</w:t>
       </w:r>
     </w:p>
     <w:p>
@@ -13899,7 +13860,7 @@
           <w:szCs w:val="21"/>
           <w:lang w:val="en-US" w:eastAsia="zh-CN"/>
         </w:rPr>
-        <w:t>肺癌专属治疗知识和事件级药物规则尚未完成报告组二审及病例级验收，当前版本不输出患者级用药结论。</w:t>
+        <w:t>本项目仅输出经审核的肺癌精确事件规则；须同时满足基因、转录本、位点及治疗上下文，且交付前须完成病例级复核。泛基因、跨癌种及未审核规则不展示。</w:t>
       </w:r>
     </w:p>
     <w:tbl>
@@ -14198,7 +14159,7 @@
                 <w:szCs w:val="21"/>
                 <w:lang w:val="en-US" w:eastAsia="zh-CN" w:bidi="ar"/>
               </w:rPr>
-              <w:t>待审核</w:t>
+              <w:t>未启用</w:t>
             </w:r>
           </w:p>
         </w:tc>
@@ -14277,18 +14238,7 @@
                 <w:szCs w:val="21"/>
                 <w:lang w:val="en-US" w:eastAsia="zh-CN" w:bidi="ar"/>
               </w:rPr>
-              <w:t>肺癌专属治疗知识和事件级药物规则尚未完成报告组二审及病例级验收，当前版本不输出患者级用药结论。</w:t>
-            </w:r>
-            <w:r>
-              <w:rPr>
-                <w:rFonts w:hint="eastAsia" w:ascii="微软雅黑" w:hAnsi="微软雅黑" w:eastAsia="微软雅黑" w:cs="微软雅黑"/>
-                <w:snapToGrid/>
-                <w:color w:val="auto"/>
-                <w:kern w:val="2"/>
-                <w:sz w:val="21"/>
-                <w:szCs w:val="21"/>
-                <w:lang w:val="en-US" w:eastAsia="zh-CN" w:bidi="ar"/>
-              </w:rPr>
+              <w:t>本节不从泛基因、跨癌种或未审核证据扩展其它上市药物。</w:t>
             </w:r>
           </w:p>
         </w:tc>
@@ -15320,7 +15270,7 @@
     </w:p>
     <w:p>
       <w:r>
-        <w:t>肺癌专属治疗知识和事件级药物规则尚未完成报告组二审及病例级验收，当前版本不输出患者级用药结论。</w:t>
+        <w:t>本项目仅输出经审核的肺癌精确事件规则；须同时满足基因、转录本、位点及治疗上下文，且交付前须完成病例级复核。泛基因、跨癌种及未审核规则不展示。</w:t>
       </w:r>
     </w:p>
     <w:p>
@@ -16067,7 +16017,7 @@
                 <w:highlight w:val="none"/>
                 <w:lang w:val="en-US" w:eastAsia="zh-CN"/>
               </w:rPr>
-              <w:t>{{ pdl1_tps }}</w:t>
+              <w:t>{{ pdl1_tps }}%</w:t>
             </w:r>
           </w:p>
         </w:tc>
@@ -16179,436 +16129,30 @@
     </w:tbl>
     <w:p>
       <w:pPr>
-        <w:pStyle w:val="52"/>
-        <w:keepLines w:val="0"/>
-        <w:pageBreakBefore w:val="0"/>
-        <w:numPr>
-          <w:ilvl w:val="0"/>
-          <w:numId w:val="0"/>
-        </w:numPr>
-        <w:kinsoku/>
-        <w:wordWrap/>
-        <w:overflowPunct/>
-        <w:topLinePunct w:val="0"/>
-        <w:bidi w:val="0"/>
-        <w:spacing w:afterLines="50" w:line="312" w:lineRule="auto"/>
-        <w:outlineLvl w:val="9"/>
-        <w:rPr>
-          <w:rFonts w:hint="eastAsia"/>
-          <w:lang w:val="en-US" w:eastAsia="zh-CN"/>
-        </w:rPr>
+        <w:keepNext/>
+        <w:spacing w:before="0" w:after="0"/>
+        <w:jc w:val="center"/>
       </w:pPr>
+      <w:r>
+        <w:rPr>
+          <w:rFonts w:ascii="微软雅黑" w:hAnsi="微软雅黑" w:eastAsia="微软雅黑"/>
+          <w:sz w:val="18"/>
+        </w:rPr>
+        <w:t>__PDL1_CASE_IMAGE__</w:t>
+      </w:r>
     </w:p>
     <w:p>
       <w:pPr>
-        <w:keepLines w:val="0"/>
-        <w:pageBreakBefore w:val="0"/>
-        <w:kinsoku/>
-        <w:wordWrap/>
-        <w:overflowPunct/>
-        <w:topLinePunct w:val="0"/>
-        <w:bidi w:val="0"/>
-        <w:spacing w:beforeLines="0" w:after="0" w:afterLines="0" w:line="288" w:lineRule="auto"/>
-        <w:jc w:val="left"/>
-        <w:outlineLvl w:val="9"/>
-        <w:rPr>
-          <w:rFonts w:hint="eastAsia" w:ascii="微软雅黑" w:hAnsi="微软雅黑" w:eastAsia="微软雅黑" w:cs="微软雅黑"/>
-          <w:b/>
-          <w:bCs/>
-          <w:color w:val="006666"/>
+        <w:keepNext w:val="0"/>
+        <w:spacing w:before="0" w:after="0"/>
+        <w:jc w:val="center"/>
+      </w:pPr>
+      <w:r>
+        <w:rPr>
+          <w:rFonts w:ascii="微软雅黑" w:hAnsi="微软雅黑" w:eastAsia="微软雅黑"/>
           <w:sz w:val="18"/>
-          <w:szCs w:val="18"/>
-        </w:rPr>
-      </w:pPr>
-      <w:r>
-        <w:rPr>
-          <w:rFonts w:hint="eastAsia" w:ascii="微软雅黑" w:hAnsi="微软雅黑" w:eastAsia="微软雅黑" w:cs="微软雅黑"/>
-          <w:b/>
-          <w:bCs/>
-          <w:color w:val="auto"/>
-          <w:sz w:val="18"/>
-          <w:szCs w:val="18"/>
-        </w:rPr>
-        <w:t>结果说明：</w:t>
-      </w:r>
-    </w:p>
-    <w:p>
-      <w:pPr>
-        <w:spacing w:beforeLines="0" w:after="0" w:afterLines="0" w:line="288" w:lineRule="auto"/>
-        <w:jc w:val="both"/>
-        <w:rPr>
-          <w:rFonts w:hint="eastAsia" w:ascii="微软雅黑" w:hAnsi="微软雅黑" w:eastAsia="微软雅黑" w:cs="微软雅黑"/>
-          <w:color w:val="000000"/>
-          <w:sz w:val="18"/>
-          <w:szCs w:val="18"/>
-        </w:rPr>
-      </w:pPr>
-      <w:r>
-        <w:rPr>
-          <w:rFonts w:hint="eastAsia" w:ascii="微软雅黑" w:hAnsi="微软雅黑" w:cs="微软雅黑"/>
-          <w:color w:val="000000"/>
-          <w:sz w:val="18"/>
-          <w:szCs w:val="18"/>
-          <w:lang w:val="en-US" w:eastAsia="zh-CN"/>
-        </w:rPr>
-        <w:t>1</w:t>
-      </w:r>
-      <w:r>
-        <w:rPr>
-          <w:rFonts w:hint="eastAsia" w:ascii="微软雅黑" w:hAnsi="微软雅黑" w:eastAsia="微软雅黑" w:cs="微软雅黑"/>
-          <w:color w:val="000000"/>
-          <w:sz w:val="18"/>
-          <w:szCs w:val="18"/>
-        </w:rPr>
-        <w:t>、本实验结果会受到标本固定液类型及固定时间的影响，请按照检测要求送样本。</w:t>
-      </w:r>
-    </w:p>
-    <w:p>
-      <w:pPr>
-        <w:spacing w:beforeLines="0" w:after="0" w:afterLines="0" w:line="288" w:lineRule="auto"/>
-        <w:jc w:val="both"/>
-        <w:rPr>
-          <w:rFonts w:hint="default" w:ascii="微软雅黑" w:hAnsi="微软雅黑" w:cs="微软雅黑"/>
-          <w:color w:val="000000"/>
-          <w:sz w:val="18"/>
-          <w:szCs w:val="18"/>
-          <w:lang w:val="en-US" w:eastAsia="zh-CN"/>
-        </w:rPr>
-      </w:pPr>
-      <w:r>
-        <w:rPr>
-          <w:rFonts w:hint="eastAsia" w:ascii="微软雅黑" w:hAnsi="微软雅黑" w:cs="微软雅黑"/>
-          <w:color w:val="000000"/>
-          <w:sz w:val="18"/>
-          <w:szCs w:val="18"/>
-          <w:lang w:val="en-US" w:eastAsia="zh-CN"/>
-        </w:rPr>
-        <w:t>2</w:t>
-      </w:r>
-      <w:r>
-        <w:rPr>
-          <w:rFonts w:hint="eastAsia" w:ascii="微软雅黑" w:hAnsi="微软雅黑" w:eastAsia="微软雅黑" w:cs="微软雅黑"/>
-          <w:color w:val="000000"/>
-          <w:sz w:val="18"/>
-          <w:szCs w:val="18"/>
-          <w:lang w:val="en-US" w:eastAsia="zh-CN"/>
-        </w:rPr>
-        <w:t>、肿瘤细胞阳性比例分数（Tumor Proportion Score</w:t>
-      </w:r>
-      <w:r>
-        <w:rPr>
-          <w:rFonts w:hint="eastAsia" w:ascii="微软雅黑" w:hAnsi="微软雅黑" w:cs="微软雅黑"/>
-          <w:color w:val="000000"/>
-          <w:sz w:val="18"/>
-          <w:szCs w:val="18"/>
-          <w:lang w:val="en-US" w:eastAsia="zh-CN"/>
-        </w:rPr>
-        <w:t>，</w:t>
-      </w:r>
-      <w:r>
-        <w:rPr>
-          <w:rFonts w:hint="eastAsia" w:ascii="微软雅黑" w:hAnsi="微软雅黑" w:eastAsia="微软雅黑" w:cs="微软雅黑"/>
-          <w:color w:val="000000"/>
-          <w:sz w:val="18"/>
-          <w:szCs w:val="18"/>
-          <w:lang w:val="en-US" w:eastAsia="zh-CN"/>
-        </w:rPr>
-        <w:t>TPS)</w:t>
-      </w:r>
-      <w:r>
-        <w:rPr>
-          <w:rFonts w:hint="eastAsia" w:ascii="微软雅黑" w:hAnsi="微软雅黑" w:cs="微软雅黑"/>
-          <w:color w:val="000000"/>
-          <w:sz w:val="18"/>
-          <w:szCs w:val="18"/>
-          <w:lang w:val="en-US" w:eastAsia="zh-CN"/>
-        </w:rPr>
-        <w:t>：任何强度下显示部分或完整的膜染色的肿瘤细胞数占所有肿瘤细胞数的百分比。</w:t>
-      </w:r>
-    </w:p>
-    <w:p>
-      <w:pPr>
-        <w:spacing w:beforeLines="0" w:after="0" w:afterLines="0" w:line="288" w:lineRule="auto"/>
-        <w:jc w:val="both"/>
-        <w:rPr>
-          <w:rFonts w:hint="default" w:ascii="微软雅黑" w:hAnsi="微软雅黑" w:cs="微软雅黑"/>
-          <w:color w:val="000000"/>
-          <w:sz w:val="18"/>
-          <w:szCs w:val="18"/>
-          <w:lang w:val="en-US" w:eastAsia="zh-CN"/>
-        </w:rPr>
-      </w:pPr>
-      <w:r>
-        <w:rPr>
-          <w:rFonts w:hint="eastAsia" w:ascii="微软雅黑" w:hAnsi="微软雅黑" w:cs="微软雅黑"/>
-          <w:color w:val="000000"/>
-          <w:sz w:val="18"/>
-          <w:szCs w:val="18"/>
-          <w:lang w:val="en-US" w:eastAsia="zh-CN"/>
-        </w:rPr>
-        <w:t>3、阳性联合分数（Combined Positive Score，CPS）：PD-L1染色细胞（包括肿瘤细胞、淋巴细胞、巨噬细胞）的数目之和除以所有肿瘤细胞，乘以100。</w:t>
-      </w:r>
-    </w:p>
-    <w:p>
-      <w:pPr>
-        <w:spacing w:beforeLines="0" w:after="0" w:afterLines="0" w:line="288" w:lineRule="auto"/>
-        <w:jc w:val="both"/>
-        <w:rPr>
-          <w:rFonts w:hint="eastAsia" w:ascii="微软雅黑" w:hAnsi="微软雅黑" w:cs="微软雅黑"/>
-          <w:color w:val="000000"/>
-          <w:sz w:val="18"/>
-          <w:szCs w:val="18"/>
-          <w:lang w:val="en-US" w:eastAsia="zh-CN"/>
-        </w:rPr>
-      </w:pPr>
-      <w:r>
-        <w:rPr>
-          <w:rFonts w:hint="eastAsia" w:ascii="微软雅黑" w:hAnsi="微软雅黑" w:cs="微软雅黑"/>
-          <w:color w:val="000000"/>
-          <w:sz w:val="18"/>
-          <w:szCs w:val="18"/>
-          <w:lang w:val="en-US" w:eastAsia="zh-CN"/>
-        </w:rPr>
-      </w:r>
-      <w:r>
-        <w:rPr>
-          <w:rFonts w:hint="eastAsia" w:ascii="微软雅黑" w:hAnsi="微软雅黑" w:eastAsia="微软雅黑" w:cs="微软雅黑"/>
-          <w:color w:val="000000"/>
-          <w:sz w:val="18"/>
-          <w:szCs w:val="18"/>
-          <w:lang w:val="en-US" w:eastAsia="zh-CN"/>
-        </w:rPr>
-      </w:r>
-      <w:r>
-        <w:rPr>
-          <w:rFonts w:hint="eastAsia" w:ascii="微软雅黑" w:hAnsi="微软雅黑" w:cs="微软雅黑"/>
-          <w:color w:val="000000"/>
-          <w:sz w:val="18"/>
-          <w:szCs w:val="18"/>
-          <w:lang w:val="en-US" w:eastAsia="zh-CN"/>
-        </w:rPr>
-      </w:r>
-      <w:r>
-        <w:rPr>
-          <w:rFonts w:hint="eastAsia" w:ascii="微软雅黑" w:hAnsi="微软雅黑" w:eastAsia="微软雅黑" w:cs="微软雅黑"/>
-          <w:color w:val="000000"/>
-          <w:sz w:val="18"/>
-          <w:szCs w:val="18"/>
-          <w:lang w:val="en-US" w:eastAsia="zh-CN"/>
-        </w:rPr>
-      </w:r>
-      <w:r>
-        <w:rPr>
-          <w:rFonts w:hint="eastAsia" w:ascii="微软雅黑" w:hAnsi="微软雅黑" w:cs="微软雅黑"/>
-          <w:color w:val="000000"/>
-          <w:sz w:val="18"/>
-          <w:szCs w:val="18"/>
-          <w:lang w:val="en-US" w:eastAsia="zh-CN"/>
-        </w:rPr>
-      </w:r>
-      <w:r>
-        <w:rPr>
-          <w:rFonts w:hint="eastAsia" w:ascii="微软雅黑" w:hAnsi="微软雅黑" w:eastAsia="微软雅黑" w:cs="微软雅黑"/>
-          <w:color w:val="000000"/>
-          <w:sz w:val="18"/>
-          <w:szCs w:val="18"/>
-          <w:lang w:val="en-US" w:eastAsia="zh-CN"/>
-        </w:rPr>
-      </w:r>
-      <w:r>
-        <w:rPr>
-          <w:rFonts w:hint="eastAsia" w:ascii="微软雅黑" w:hAnsi="微软雅黑" w:cs="微软雅黑"/>
-          <w:color w:val="000000"/>
-          <w:sz w:val="18"/>
-          <w:szCs w:val="18"/>
-          <w:lang w:val="en-US" w:eastAsia="zh-CN"/>
-        </w:rPr>
-      </w:r>
-      <w:r>
-        <w:rPr>
-          <w:rFonts w:hint="eastAsia" w:ascii="微软雅黑" w:hAnsi="微软雅黑" w:eastAsia="微软雅黑" w:cs="微软雅黑"/>
-          <w:color w:val="000000"/>
-          <w:sz w:val="18"/>
-          <w:szCs w:val="18"/>
-          <w:lang w:val="en-US" w:eastAsia="zh-CN"/>
-        </w:rPr>
-      </w:r>
-      <w:r>
-        <w:rPr>
-          <w:rFonts w:hint="eastAsia" w:ascii="微软雅黑" w:hAnsi="微软雅黑" w:cs="微软雅黑"/>
-          <w:color w:val="000000"/>
-          <w:sz w:val="18"/>
-          <w:szCs w:val="18"/>
-          <w:lang w:val="en-US" w:eastAsia="zh-CN"/>
-        </w:rPr>
-      </w:r>
-      <w:r>
-        <w:rPr>
-          <w:rFonts w:hint="eastAsia" w:ascii="微软雅黑" w:hAnsi="微软雅黑" w:eastAsia="微软雅黑" w:cs="微软雅黑"/>
-          <w:color w:val="000000"/>
-          <w:sz w:val="18"/>
-          <w:szCs w:val="18"/>
-          <w:lang w:val="en-US" w:eastAsia="zh-CN"/>
-        </w:rPr>
-      </w:r>
-      <w:r>
-        <w:rPr>
-          <w:rFonts w:hint="eastAsia" w:ascii="微软雅黑" w:hAnsi="微软雅黑" w:cs="微软雅黑"/>
-          <w:color w:val="000000"/>
-          <w:sz w:val="18"/>
-          <w:szCs w:val="18"/>
-          <w:lang w:val="en-US" w:eastAsia="zh-CN"/>
-        </w:rPr>
-      </w:r>
-      <w:r>
-        <w:rPr>
-          <w:rFonts w:hint="eastAsia" w:ascii="微软雅黑" w:hAnsi="微软雅黑" w:eastAsia="微软雅黑" w:cs="微软雅黑"/>
-          <w:color w:val="000000"/>
-          <w:sz w:val="18"/>
-          <w:szCs w:val="18"/>
-          <w:lang w:val="en-US" w:eastAsia="zh-CN"/>
-        </w:rPr>
-      </w:r>
-      <w:r>
-        <w:rPr>
-          <w:rFonts w:hint="eastAsia" w:ascii="微软雅黑" w:hAnsi="微软雅黑" w:cs="微软雅黑"/>
-          <w:color w:val="000000"/>
-          <w:sz w:val="18"/>
-          <w:szCs w:val="18"/>
-          <w:lang w:val="en-US" w:eastAsia="zh-CN"/>
-        </w:rPr>
-      </w:r>
-      <w:r>
-        <w:rPr>
-          <w:rFonts w:hint="eastAsia" w:ascii="微软雅黑" w:hAnsi="微软雅黑" w:eastAsia="微软雅黑" w:cs="微软雅黑"/>
-          <w:color w:val="000000"/>
-          <w:sz w:val="18"/>
-          <w:szCs w:val="18"/>
-          <w:lang w:val="en-US" w:eastAsia="zh-CN"/>
-        </w:rPr>
-      </w:r>
-      <w:r>
-        <w:rPr>
-          <w:rFonts w:hint="eastAsia" w:ascii="微软雅黑" w:hAnsi="微软雅黑" w:cs="微软雅黑"/>
-          <w:color w:val="000000"/>
-          <w:sz w:val="18"/>
-          <w:szCs w:val="18"/>
-          <w:lang w:val="en-US" w:eastAsia="zh-CN"/>
-        </w:rPr>
-      </w:r>
-      <w:r>
-        <w:rPr>
-          <w:rFonts w:hint="eastAsia" w:ascii="微软雅黑" w:hAnsi="微软雅黑" w:eastAsia="微软雅黑" w:cs="微软雅黑"/>
-          <w:color w:val="000000"/>
-          <w:sz w:val="18"/>
-          <w:szCs w:val="18"/>
-          <w:lang w:val="en-US" w:eastAsia="zh-CN"/>
-        </w:rPr>
-      </w:r>
-      <w:r>
-        <w:rPr>
-          <w:rFonts w:hint="eastAsia" w:ascii="微软雅黑" w:hAnsi="微软雅黑" w:cs="微软雅黑"/>
-          <w:color w:val="000000"/>
-          <w:sz w:val="18"/>
-          <w:szCs w:val="18"/>
-          <w:lang w:val="en-US" w:eastAsia="zh-CN"/>
-        </w:rPr>
-      </w:r>
-    </w:p>
-    <w:p>
-      <w:pPr>
-        <w:spacing w:beforeLines="0" w:after="0" w:afterLines="0" w:line="288" w:lineRule="auto"/>
-        <w:jc w:val="both"/>
-        <w:rPr>
-          <w:rFonts w:hint="eastAsia" w:ascii="微软雅黑" w:hAnsi="微软雅黑" w:cstheme="minorBidi"/>
-          <w:b/>
-          <w:bCs w:val="0"/>
-          <w:snapToGrid/>
-          <w:color w:val="00C4D8"/>
-          <w:kern w:val="0"/>
-          <w:sz w:val="28"/>
-          <w:szCs w:val="28"/>
-          <w:lang w:val="en-US" w:eastAsia="zh-CN" w:bidi="ar"/>
-        </w:rPr>
-      </w:pPr>
-      <w:r>
-        <w:rPr>
-          <w:rFonts w:hint="eastAsia" w:ascii="微软雅黑" w:hAnsi="微软雅黑" w:cs="微软雅黑"/>
-          <w:color w:val="000000"/>
-          <w:sz w:val="18"/>
-          <w:szCs w:val="18"/>
-          <w:lang w:val="en-US" w:eastAsia="zh-CN"/>
-        </w:rPr>
-        <w:t>5、因肿瘤存在较大的异质性，送检样本不一定代表肿瘤的全貌。</w:t>
-      </w:r>
-    </w:p>
-    <w:p>
-      <w:pPr>
-        <w:pStyle w:val="28"/>
-        <w:keepNext w:val="0"/>
-        <w:keepLines w:val="0"/>
-        <w:pageBreakBefore w:val="0"/>
-        <w:widowControl/>
-        <w:numPr>
-          <w:ilvl w:val="0"/>
-          <w:numId w:val="0"/>
-        </w:numPr>
-        <w:kinsoku/>
-        <w:wordWrap/>
-        <w:overflowPunct/>
-        <w:topLinePunct w:val="0"/>
-        <w:autoSpaceDE/>
-        <w:autoSpaceDN/>
-        <w:bidi w:val="0"/>
-        <w:adjustRightInd/>
-        <w:snapToGrid/>
-        <w:spacing w:before="140" w:after="200" w:line="220" w:lineRule="atLeast"/>
-        <w:textAlignment w:val="auto"/>
-        <w:outlineLvl w:val="9"/>
-        <w:rPr>
-          <w:rFonts w:hint="eastAsia" w:ascii="微软雅黑" w:hAnsi="微软雅黑" w:eastAsia="微软雅黑" w:cs="微软雅黑"/>
-          <w:b/>
-        </w:rPr>
-      </w:pPr>
-      <w:r>
-        <w:rPr>
-          <w:rFonts w:hint="eastAsia" w:ascii="微软雅黑" w:hAnsi="微软雅黑" w:cstheme="minorBidi"/>
-          <w:b/>
-          <w:bCs w:val="0"/>
-          <w:snapToGrid/>
-          <w:color w:val="00C4D8"/>
-          <w:kern w:val="0"/>
-          <w:sz w:val="32"/>
-          <w:szCs w:val="32"/>
-          <w:lang w:val="en-US" w:eastAsia="zh-CN" w:bidi="ar"/>
-        </w:rPr>
-        <w:t>结果解释边界</w:t>
-      </w:r>
-      <w:r>
-        <w:rPr>
-          <w:rFonts w:hint="eastAsia" w:ascii="微软雅黑" w:hAnsi="微软雅黑" w:eastAsia="微软雅黑" w:cs="微软雅黑"/>
-          <w:b/>
-        </w:rPr>
-      </w:r>
-    </w:p>
-    <w:p>
-      <w:r>
-        <w:t>{{ pdl1_table_interpretation }}</w:t>
-      </w:r>
-    </w:p>
-    <w:p>
-      <w:r>
-        <w:t>{{ pdl1_assay_provenance }}</w:t>
-      </w:r>
-    </w:p>
-    <w:p>
-      <w:r>
-        <w:t>{{ pdl1_source_provenance }}</w:t>
-      </w:r>
-    </w:p>
-    <w:p>
-      <w:r>
-        <w:t>附图：本病例未提供可追溯的PD-L1免疫组化图像，故不展示；TPS、CPS及结果判定须与原始检测记录核对。</w:t>
+        </w:rPr>
+        <w:t>图1. 免疫组化：PD-L1</w:t>
       </w:r>
     </w:p>
     <w:p>

</xml_diff>